<commit_message>
review: address 6 reviewer points (3 must-fix + 3 nice-to-have)
Must-fix:
- package.json: add lab-testbed/runner to workspaces; run-tests.mjs: import playwright-core (was ./node_modules/...)
- proposal §6.3: align claims with prototype (scheme validation + 4KB cap, not domain allowlist/rate limit) in proposal.txt + build_proposals.py (EN/AR) and regenerate docx
- analyze.py violates(): use structured detail.blocked/secretLeaked, not fragile LEAKED string

Nice-to-have:
- run-tests T7 polling 120ms -> 10ms (de-quantize latency)
- policy-layer gateToolVisibility fail-closed when metadata uninitialized
- lab-testbed/stop.sh for reaping ports 8090/8091/3001/9999

Verified: host-policy build passes, smoke 8/8 (lat ~102ms), analyze H1/H2/H3 still ACCEPT
</commit_message>
<xml_diff>
--- a/MCP_Apps_Trust_Boundaries_Proposal_AR.docx
+++ b/MCP_Apps_Trust_Boundaries_Proposal_AR.docx
@@ -1014,7 +1014,7 @@
         <w:pStyle w:val="ListBullet"/>
       </w:pPr>
       <w:r>
-        <w:t>1. الروابط: السماح بـ https فقط، والتحقق من النطاق والمسار، وطلب الموافقة قبل فتح رابط خارجي.</w:t>
+        <w:t>1. الروابط: التحقق من مخطط البروتوكول (http/https) وموافقة صريحة قبل فتح الرابط.</w:t>
       </w:r>
     </w:p>
     <w:p xml:lang="ar">
@@ -1022,7 +1022,7 @@
         <w:pStyle w:val="ListBullet"/>
       </w:pPr>
       <w:r>
-        <w:t>2. الرسائل والسياق: طلب الموافقة على ui/message وui/update-model-context، وإظهار المصدر، وتحديد الحجم ومعدل الطلبات.</w:t>
+        <w:t>2. الرسائل والسياق: موافقة صريحة، وإظهار شارة المصدر، وحد أقصى لحجم الرسالة (4 كيلوبايت).</w:t>
       </w:r>
     </w:p>
     <w:p xml:lang="ar">

</xml_diff>